<commit_message>
Add repository link to final SRS
</commit_message>
<xml_diff>
--- a/docs/SchoolTrust_AI_SRS.docx
+++ b/docs/SchoolTrust_AI_SRS.docx
@@ -470,12 +470,12 @@
             <w:r>
               <w:rPr>
                 <w:rFonts w:ascii="Calibri" w:hAnsi="Calibri"/>
-                <w:b/>
+                <w:b w:val="0"/>
                 <w:i w:val="0"/>
                 <w:color w:val="17223B"/>
                 <w:sz w:val="19"/>
               </w:rPr>
-              <w:t>[ENTER IF AVAILABLE]</w:t>
+              <w:t>https://github.com/moeen507/SchoolTrust-AI</w:t>
             </w:r>
           </w:p>
         </w:tc>

</xml_diff>